<commit_message>
Update Final Submission Group Table.docx
</commit_message>
<xml_diff>
--- a/Design Documents/Final Submission Group Table.docx
+++ b/Design Documents/Final Submission Group Table.docx
@@ -935,15 +935,7 @@
               <w:br/>
             </w:r>
             <w:r>
-              <w:t xml:space="preserve">TP will cover introduction and </w:t>
-            </w:r>
-            <w:proofErr w:type="gramStart"/>
-            <w:r>
-              <w:t>conclusion,</w:t>
-            </w:r>
-            <w:proofErr w:type="gramEnd"/>
-            <w:r>
-              <w:t xml:space="preserve"> each member contributes to their own part</w:t>
+              <w:t>TP will cover introduction and conclusion, each member contributes to their own part</w:t>
             </w:r>
           </w:p>
         </w:tc>
@@ -1062,15 +1054,7 @@
           </w:tcPr>
           <w:p>
             <w:r>
-              <w:t>TP/MB</w:t>
-            </w:r>
-            <w:proofErr w:type="gramStart"/>
-            <w:r>
-              <w:t>/  /</w:t>
-            </w:r>
-            <w:proofErr w:type="gramEnd"/>
-            <w:r>
-              <w:t xml:space="preserve">   -</w:t>
+              <w:t>TP/MB/  /   -</w:t>
             </w:r>
           </w:p>
         </w:tc>
@@ -1103,6 +1087,11 @@
           <w:tcPr>
             <w:tcW w:w="3005" w:type="dxa"/>
           </w:tcPr>
+          <w:p>
+            <w:r>
+              <w:t>AI Video / Slides / Presentation Notes – MB 29-Apr-2026</w:t>
+            </w:r>
+          </w:p>
           <w:p/>
         </w:tc>
       </w:tr>

</xml_diff>